<commit_message>
Update project documentation and Docker configuration
</commit_message>
<xml_diff>
--- a/DOCUMENT/10_Chapter7_BibliographyAndReferences.docx
+++ b/DOCUMENT/10_Chapter7_BibliographyAndReferences.docx
@@ -50,23 +50,7 @@
           <w:rFonts w:asciiTheme="majorHAnsi" w:hAnsiTheme="majorHAnsi" w:cstheme="majorHAnsi"/>
           <w:sz w:val="24"/>
         </w:rPr>
-        <w:t>The following books, official documentation, and web resources were referred to during the analysis, design, development, and documentation of the “</w:t>
-      </w:r>
-      <w:proofErr w:type="spellStart"/>
-      <w:r>
-        <w:rPr>
-          <w:rFonts w:asciiTheme="majorHAnsi" w:hAnsiTheme="majorHAnsi" w:cstheme="majorHAnsi"/>
-          <w:sz w:val="24"/>
-        </w:rPr>
-        <w:t>StreamHub</w:t>
-      </w:r>
-      <w:proofErr w:type="spellEnd"/>
-      <w:r>
-        <w:rPr>
-          <w:rFonts w:asciiTheme="majorHAnsi" w:hAnsiTheme="majorHAnsi" w:cstheme="majorHAnsi"/>
-          <w:sz w:val="24"/>
-        </w:rPr>
-        <w:t>” project.</w:t>
+        <w:t>The following books, official documentation, and web resources were referred to during the analysis, design, development, and documentation of the “StreamHub” project.</w:t>
       </w:r>
     </w:p>
     <w:p>
@@ -83,26 +67,7 @@
           <w:color w:val="B91C1C"/>
           <w:sz w:val="28"/>
         </w:rPr>
-        <w:t>7.1 Books</w:t>
-      </w:r>
-      <w:r>
-        <w:rPr>
-          <w:rFonts w:asciiTheme="majorHAnsi" w:hAnsiTheme="majorHAnsi" w:cstheme="majorHAnsi"/>
-          <w:b/>
-          <w:color w:val="B91C1C"/>
-          <w:sz w:val="28"/>
-        </w:rPr>
-        <w:t xml:space="preserve"> </w:t>
-      </w:r>
-      <w:proofErr w:type="spellStart"/>
-      <w:r>
-        <w:rPr>
-          <w:rFonts w:asciiTheme="majorHAnsi" w:hAnsiTheme="majorHAnsi" w:cstheme="majorHAnsi"/>
-          <w:b/>
-          <w:color w:val="B91C1C"/>
-          <w:sz w:val="28"/>
-        </w:rPr>
-        <w:t>References</w:t>
+        <w:t>7.1 Books References</w:t>
       </w:r>
       <w:r>
         <w:rPr>
@@ -113,7 +78,6 @@
         </w:rPr>
         <w:t>s</w:t>
       </w:r>
-      <w:proofErr w:type="spellEnd"/>
     </w:p>
     <w:p>
       <w:pPr>
@@ -268,23 +232,7 @@
           <w:rFonts w:asciiTheme="majorHAnsi" w:hAnsiTheme="majorHAnsi" w:cstheme="majorHAnsi"/>
           <w:sz w:val="23"/>
         </w:rPr>
-        <w:t xml:space="preserve">Laurentiu </w:t>
-      </w:r>
-      <w:proofErr w:type="spellStart"/>
-      <w:r>
-        <w:rPr>
-          <w:rFonts w:asciiTheme="majorHAnsi" w:hAnsiTheme="majorHAnsi" w:cstheme="majorHAnsi"/>
-          <w:sz w:val="23"/>
-        </w:rPr>
-        <w:t>Spilca</w:t>
-      </w:r>
-      <w:proofErr w:type="spellEnd"/>
-      <w:r>
-        <w:rPr>
-          <w:rFonts w:asciiTheme="majorHAnsi" w:hAnsiTheme="majorHAnsi" w:cstheme="majorHAnsi"/>
-          <w:sz w:val="23"/>
-        </w:rPr>
-        <w:t>, “Spring Security in Action,” Manning Publications, 2020.</w:t>
+        <w:t>Laurentiu Spilca, “Spring Security in Action,” Manning Publications, 2020.</w:t>
       </w:r>
     </w:p>
     <w:p>
@@ -773,34 +721,14 @@
           <w:color w:val="B91C1C"/>
           <w:sz w:val="23"/>
         </w:rPr>
-        <w:t>[9</w:t>
+        <w:t xml:space="preserve">[9] </w:t>
       </w:r>
-      <w:proofErr w:type="gramStart"/>
-      <w:r>
-        <w:rPr>
-          <w:rFonts w:asciiTheme="majorHAnsi" w:hAnsiTheme="majorHAnsi" w:cstheme="majorHAnsi"/>
-          <w:b/>
-          <w:color w:val="B91C1C"/>
-          <w:sz w:val="23"/>
-        </w:rPr>
-        <w:t xml:space="preserve">]  </w:t>
-      </w:r>
-      <w:proofErr w:type="spellStart"/>
       <w:r>
         <w:rPr>
           <w:rFonts w:asciiTheme="majorHAnsi" w:hAnsiTheme="majorHAnsi" w:cstheme="majorHAnsi"/>
           <w:sz w:val="23"/>
         </w:rPr>
-        <w:t>FFmpeg</w:t>
-      </w:r>
-      <w:proofErr w:type="spellEnd"/>
-      <w:proofErr w:type="gramEnd"/>
-      <w:r>
-        <w:rPr>
-          <w:rFonts w:asciiTheme="majorHAnsi" w:hAnsiTheme="majorHAnsi" w:cstheme="majorHAnsi"/>
-          <w:sz w:val="23"/>
-        </w:rPr>
-        <w:t xml:space="preserve"> Official Documentation – </w:t>
+        <w:t xml:space="preserve">FFmpeg Official Documentation – </w:t>
       </w:r>
       <w:hyperlink r:id="rId16" w:history="1">
         <w:r>
@@ -934,21 +862,12 @@
         </w:rPr>
         <w:t xml:space="preserve">[12] </w:t>
       </w:r>
-      <w:proofErr w:type="spellStart"/>
       <w:r>
         <w:rPr>
           <w:rFonts w:asciiTheme="majorHAnsi" w:hAnsiTheme="majorHAnsi" w:cstheme="majorHAnsi"/>
           <w:sz w:val="23"/>
         </w:rPr>
-        <w:t>Zustand</w:t>
-      </w:r>
-      <w:proofErr w:type="spellEnd"/>
-      <w:r>
-        <w:rPr>
-          <w:rFonts w:asciiTheme="majorHAnsi" w:hAnsiTheme="majorHAnsi" w:cstheme="majorHAnsi"/>
-          <w:sz w:val="23"/>
-        </w:rPr>
-        <w:t xml:space="preserve"> State Management Documentation – </w:t>
+        <w:t xml:space="preserve">Zustand State Management Documentation – </w:t>
       </w:r>
       <w:hyperlink r:id="rId19" w:history="1">
         <w:r>
@@ -1034,23 +953,7 @@
           <w:rFonts w:asciiTheme="majorHAnsi" w:hAnsiTheme="majorHAnsi" w:cstheme="majorHAnsi"/>
           <w:sz w:val="23"/>
         </w:rPr>
-        <w:t xml:space="preserve">Swagger / </w:t>
-      </w:r>
-      <w:proofErr w:type="spellStart"/>
-      <w:r>
-        <w:rPr>
-          <w:rFonts w:asciiTheme="majorHAnsi" w:hAnsiTheme="majorHAnsi" w:cstheme="majorHAnsi"/>
-          <w:sz w:val="23"/>
-        </w:rPr>
-        <w:t>OpenAPI</w:t>
-      </w:r>
-      <w:proofErr w:type="spellEnd"/>
-      <w:r>
-        <w:rPr>
-          <w:rFonts w:asciiTheme="majorHAnsi" w:hAnsiTheme="majorHAnsi" w:cstheme="majorHAnsi"/>
-          <w:sz w:val="23"/>
-        </w:rPr>
-        <w:t xml:space="preserve"> Documentation – </w:t>
+        <w:t xml:space="preserve">Swagger / OpenAPI Documentation – </w:t>
       </w:r>
       <w:hyperlink r:id="rId21" w:history="1">
         <w:r>
@@ -1174,21 +1077,12 @@
         </w:rPr>
         <w:t xml:space="preserve">[17] </w:t>
       </w:r>
-      <w:proofErr w:type="spellStart"/>
       <w:r>
         <w:rPr>
           <w:rFonts w:asciiTheme="majorHAnsi" w:hAnsiTheme="majorHAnsi" w:cstheme="majorHAnsi"/>
           <w:sz w:val="23"/>
         </w:rPr>
-        <w:t>GeeksforGeeks</w:t>
-      </w:r>
-      <w:proofErr w:type="spellEnd"/>
-      <w:r>
-        <w:rPr>
-          <w:rFonts w:asciiTheme="majorHAnsi" w:hAnsiTheme="majorHAnsi" w:cstheme="majorHAnsi"/>
-          <w:sz w:val="23"/>
-        </w:rPr>
-        <w:t xml:space="preserve"> – </w:t>
+        <w:t xml:space="preserve">GeeksforGeeks – </w:t>
       </w:r>
       <w:hyperlink r:id="rId24" w:history="1">
         <w:r>
@@ -1299,23 +1193,7 @@
         <w:rFonts w:ascii="Times New Roman" w:hAnsi="Times New Roman"/>
         <w:b/>
       </w:rPr>
-      <w:t xml:space="preserve">Group No – </w:t>
-    </w:r>
-    <w:proofErr w:type="spellStart"/>
-    <w:r>
-      <w:rPr>
-        <w:rFonts w:ascii="Times New Roman" w:hAnsi="Times New Roman"/>
-        <w:b/>
-      </w:rPr>
-      <w:t>StreamHub</w:t>
-    </w:r>
-    <w:proofErr w:type="spellEnd"/>
-    <w:r>
-      <w:rPr>
-        <w:rFonts w:ascii="Times New Roman" w:hAnsi="Times New Roman"/>
-        <w:b/>
-      </w:rPr>
-      <w:t xml:space="preserve"> Project</w:t>
+      <w:t>Group No – StreamHub Project</w:t>
     </w:r>
     <w:r>
       <w:tab/>

</xml_diff>